<commit_message>
Epicor+SugarAI integration page: fix two Avasant stat lines echoing source wording
An independent post-delivery plagiarism check found the A1 stat description and the
A2 Block 5 sentence tracked Avasant's own sentence construction too closely (6-10
word verbatim runs beyond the required cohort qualifier). Reworded both with the same
facts and cohort qualifier but different sentence structure, and propagated the fix to
draft-v3.md, the sources log, and the delivered HTML/docx/PDF.

Co-Authored-By: Claude Sonnet 5 <noreply@anthropic.com>
Claude-Session: https://claude.ai/code/session_01JX9jUeMXo5BjnNTgQc8zQL
</commit_message>
<xml_diff>
--- a/content-pipeline/requirements/2026-10-07-epicor-sugarai-integration/output/epicor-sugarai-integration.docx
+++ b/content-pipeline/requirements/2026-10-07-epicor-sugarai-integration/output/epicor-sugarai-integration.docx
@@ -1960,7 +1960,7 @@
                 <w:sz w:val="18"/>
                 <w:szCs w:val="18"/>
               </w:rPr>
-              <w:t xml:space="preserve">How much likelier mid-sized enterprises that prioritise interoperability and eliminate data silos are to see measurable satisfaction gains, Avasant found.</w:t>
+              <w:t xml:space="preserve">The customer-satisfaction gain Avasant found among mid-sized enterprises that unify their systems and close off data silos.</w:t>
             </w:r>
             <w:r>
               <w:rPr>
@@ -3451,7 +3451,7 @@
         <w:jc w:val="both"/>
       </w:pPr>
       <w:r>
-        <w:t xml:space="preserve">CRM integration with Epicor ERP turns two accurate systems into one working view of each customer. That matters because, according to Avasant, more than 60% of enterprises still operate with fragmented data environments.</w:t>
+        <w:t xml:space="preserve">CRM integration with Epicor ERP turns two accurate systems into one working view of each customer. That matters because fragmented data still weighs down more than 60% of enterprises, Avasant finds.</w:t>
       </w:r>
       <w:r>
         <w:rPr>

</xml_diff>

<commit_message>
Epicor+SugarAI integration page: remove manufacturing/distribution industry targeting
Content Writer wants this page positioned as general CRM integration with Epicor
ERP, not aimed at the manufacturing/distribution industry. Changed the hero lede,
hero side-panel sub-line (dropped the industries link), the IMG-3/IMG-4 designer
mock-up company name (Gulf Fasteners Trading LLC -> Meridian Holdings LLC, a
neutral name), and removed the 'Manufacturing & distribution' footer link.
Propagated to draft-v3.md, the sources log, and the delivered HTML/docx/PDF.

Co-Authored-By: Claude Sonnet 5 <noreply@anthropic.com>
Claude-Session: https://claude.ai/code/session_01JX9jUeMXo5BjnNTgQc8zQL
</commit_message>
<xml_diff>
--- a/content-pipeline/requirements/2026-10-07-epicor-sugarai-integration/output/epicor-sugarai-integration.docx
+++ b/content-pipeline/requirements/2026-10-07-epicor-sugarai-integration/output/epicor-sugarai-integration.docx
@@ -780,7 +780,7 @@
                 <w:sz w:val="18"/>
                 <w:szCs w:val="18"/>
               </w:rPr>
-              <w:t xml:space="preserve">CRM Solutions (SugarAI) (https://hlbhamt.com/sugarai-crm-2/) · Manufacturing &amp; distribution (https://hlbhamt.com/industries/manufacture-and-distribution/) · ERP integration &amp; add-ons (https://hlbhamt.com/services/erp-integration-add-ons/)</w:t>
+              <w:t xml:space="preserve">CRM Solutions (SugarAI) (https://hlbhamt.com/sugarai-crm-2/) · ERP integration &amp; add-ons (https://hlbhamt.com/services/erp-integration-add-ons/)</w:t>
             </w:r>
           </w:p>
         </w:tc>
@@ -1061,7 +1061,7 @@
         <w:t xml:space="preserve">Intro paragraph: </w:t>
       </w:r>
       <w:r>
-        <w:t xml:space="preserve">HLB HAMT connects SugarAI with Epicor ERP as you already run it, so sales and service teams see Epicor orders, prices, stock and invoices on their customer records. Epicor stays the system of record, while we design, build and support a custom connection for UAE and GCC manufacturers and distributors on cloud or on-premise Epicor.</w:t>
+        <w:t xml:space="preserve">HLB HAMT connects SugarAI with Epicor ERP as you already run it, so sales and service teams see Epicor orders, prices, stock and invoices on their customer records. Epicor stays the system of record, while we design, build and support a custom connection for UAE and GCC businesses on cloud or on-premise Epicor.</w:t>
       </w:r>
     </w:p>
     <w:p>
@@ -1136,19 +1136,7 @@
         <w:t xml:space="preserve">Sub-line: </w:t>
       </w:r>
       <w:r>
-        <w:t xml:space="preserve">Set up for </w:t>
-      </w:r>
-      <w:hyperlink w:history="1" r:id="rIdgeiuh5c6cazlcrncgp6wk">
-        <w:r>
-          <w:rPr>
-            <w:color w:val="10538F"/>
-            <w:u w:val="single"/>
-          </w:rPr>
-          <w:t xml:space="preserve">manufacturers and distributors</w:t>
-        </w:r>
-      </w:hyperlink>
-      <w:r>
-        <w:t xml:space="preserve"> running Epicor across the UAE and GCC.</w:t>
+        <w:t xml:space="preserve">Set up for businesses running Epicor across the UAE and GCC.</w:t>
       </w:r>
     </w:p>
     <w:tbl>
@@ -3585,7 +3573,7 @@
                 <w:sz w:val="17"/>
                 <w:szCs w:val="17"/>
               </w:rPr>
-              <w:t xml:space="preserve">Designer mock-up (no demo instance exists yet, brief Section 10 point 4) of a SugarAI account record for a fictional UAE distributor, "Gulf Fasteners Trading LLC". Opportunity pipeline on the left; on the right, an Epicor panel showing payment terms, credit status, open sales orders and the last five invoices. Standard SugarAI theme. Fictional data only, no other company names, no third-party logos; layout built from scratch.</w:t>
+              <w:t xml:space="preserve">Designer mock-up (no demo instance exists yet, brief Section 10 point 4) of a SugarAI account record for a fictional UAE company, "Meridian Holdings LLC". Opportunity pipeline on the left; on the right, an Epicor panel showing payment terms, credit status, open sales orders and the last five invoices. Standard SugarAI theme. Fictional data only, no other company names, no third-party logos; layout built from scratch.</w:t>
             </w:r>
           </w:p>
         </w:tc>
@@ -4422,7 +4410,7 @@
                 <w:sz w:val="17"/>
                 <w:szCs w:val="17"/>
               </w:rPr>
-              <w:t xml:space="preserve">Designer mock-up composite (no demo instance exists yet). Left: Outlook with the Sugar Connect sidebar open on a contact, showing the related account. Right: the SugarAI mobile app on a phone showing the same account with its Epicor-synchronised fields (payment terms, recent orders). Fictional data only (reuse "Gulf Fasteners Trading LLC" from IMG-3 for consistency). Layout built from scratch; no logos beyond the native product UI.</w:t>
+              <w:t xml:space="preserve">Designer mock-up composite (no demo instance exists yet). Left: Outlook with the Sugar Connect sidebar open on a contact, showing the related account. Right: the SugarAI mobile app on a phone showing the same account with its Epicor-synchronised fields (payment terms, recent orders). Fictional data only (reuse "Meridian Holdings LLC" from IMG-3 for consistency). Layout built from scratch; no logos beyond the native product UI.</w:t>
             </w:r>
           </w:p>
         </w:tc>

</xml_diff>